<commit_message>
Implementada a integração do campo `reportIntroduction` nos relatórios DOCX, permitindo personalização automática da introdução com dados do cliente. Atualizado o template do Word para incluir o placeholder `{introducao}` e ajustado o código em `ReportConfigCard.tsx` para garantir o preenchimento correto. Melhorias na eficiência e escalabilidade da geração de relatórios individuais e em lote.
</commit_message>
<xml_diff>
--- a/public/templates/template - Nova Estrutura.docx
+++ b/public/templates/template - Nova Estrutura.docx
@@ -130,10 +130,12 @@
           <w:sz w:val="44"/>
           <w:szCs w:val="44"/>
         </w:rPr>
-        <w:t>{</w:t>
-      </w:r>
-      <w:proofErr w:type="spellStart"/>
-      <w:r>
+        <w:t>{entidade_cliente}</w:t>
+      </w:r>
+    </w:p>
+    <w:p>
+      <w:pPr>
+        <w:jc w:val="center"/>
         <w:rPr>
           <w:b/>
           <w:bCs/>
@@ -141,9 +143,7 @@
           <w:sz w:val="44"/>
           <w:szCs w:val="44"/>
         </w:rPr>
-        <w:t>entidade_cliente</w:t>
-      </w:r>
-      <w:proofErr w:type="spellEnd"/>
+      </w:pPr>
       <w:r>
         <w:rPr>
           <w:b/>
@@ -152,12 +152,9 @@
           <w:sz w:val="44"/>
           <w:szCs w:val="44"/>
         </w:rPr>
-        <w:t>}</w:t>
-      </w:r>
-    </w:p>
-    <w:p>
-      <w:pPr>
-        <w:jc w:val="center"/>
+        <w:t>{</w:t>
+      </w:r>
+      <w:r>
         <w:rPr>
           <w:b/>
           <w:bCs/>
@@ -165,7 +162,8 @@
           <w:sz w:val="44"/>
           <w:szCs w:val="44"/>
         </w:rPr>
-      </w:pPr>
+        <w:t>data_inicial</w:t>
+      </w:r>
       <w:r>
         <w:rPr>
           <w:b/>
@@ -174,9 +172,8 @@
           <w:sz w:val="44"/>
           <w:szCs w:val="44"/>
         </w:rPr>
-        <w:t>{</w:t>
-      </w:r>
-      <w:proofErr w:type="spellStart"/>
+        <w:t>}</w:t>
+      </w:r>
       <w:r>
         <w:rPr>
           <w:b/>
@@ -185,50 +182,7 @@
           <w:sz w:val="44"/>
           <w:szCs w:val="44"/>
         </w:rPr>
-        <w:t>data_inicial</w:t>
-      </w:r>
-      <w:proofErr w:type="spellEnd"/>
-      <w:r>
-        <w:rPr>
-          <w:b/>
-          <w:bCs/>
-          <w:color w:val="2F5496"/>
-          <w:sz w:val="44"/>
-          <w:szCs w:val="44"/>
-        </w:rPr>
-        <w:t>}</w:t>
-      </w:r>
-      <w:r>
-        <w:rPr>
-          <w:b/>
-          <w:bCs/>
-          <w:color w:val="2F5496"/>
-          <w:sz w:val="44"/>
-          <w:szCs w:val="44"/>
-        </w:rPr>
-        <w:t xml:space="preserve"> - {</w:t>
-      </w:r>
-      <w:proofErr w:type="spellStart"/>
-      <w:r>
-        <w:rPr>
-          <w:b/>
-          <w:bCs/>
-          <w:color w:val="2F5496"/>
-          <w:sz w:val="44"/>
-          <w:szCs w:val="44"/>
-        </w:rPr>
-        <w:t>data_final</w:t>
-      </w:r>
-      <w:proofErr w:type="spellEnd"/>
-      <w:r>
-        <w:rPr>
-          <w:b/>
-          <w:bCs/>
-          <w:color w:val="2F5496"/>
-          <w:sz w:val="44"/>
-          <w:szCs w:val="44"/>
-        </w:rPr>
-        <w:t>}</w:t>
+        <w:t xml:space="preserve"> - {data_final}</w:t>
       </w:r>
     </w:p>
     <w:p>
@@ -1455,69 +1409,23 @@
           <w:sz w:val="24"/>
           <w:szCs w:val="24"/>
         </w:rPr>
-        <w:t xml:space="preserve">O presente relatório tem por objetivo demonstrar as principais atividades de   Consultoria Técnica no eSocial realizadas entre a data de </w:t>
-      </w:r>
-      <w:r>
-        <w:rPr>
-          <w:rFonts w:ascii="Montserrat" w:hAnsi="Montserrat"/>
-          <w:b/>
-          <w:bCs/>
-          <w:sz w:val="24"/>
-          <w:szCs w:val="24"/>
-        </w:rPr>
-        <w:t>{</w:t>
-      </w:r>
-      <w:proofErr w:type="spellStart"/>
-      <w:r>
-        <w:rPr>
-          <w:rFonts w:ascii="Montserrat" w:hAnsi="Montserrat"/>
-          <w:b/>
-          <w:bCs/>
-          <w:sz w:val="24"/>
-          <w:szCs w:val="24"/>
-        </w:rPr>
-        <w:t>data_inicial</w:t>
-      </w:r>
-      <w:proofErr w:type="spellEnd"/>
-      <w:r>
-        <w:rPr>
-          <w:rFonts w:ascii="Montserrat" w:hAnsi="Montserrat"/>
-          <w:b/>
-          <w:bCs/>
-          <w:sz w:val="24"/>
-          <w:szCs w:val="24"/>
-        </w:rPr>
-        <w:t>} até {</w:t>
-      </w:r>
-      <w:proofErr w:type="spellStart"/>
-      <w:r>
-        <w:rPr>
-          <w:rFonts w:ascii="Montserrat" w:hAnsi="Montserrat"/>
-          <w:b/>
-          <w:bCs/>
-          <w:sz w:val="24"/>
-          <w:szCs w:val="24"/>
-        </w:rPr>
-        <w:t>data_final</w:t>
-      </w:r>
-      <w:proofErr w:type="spellEnd"/>
-      <w:r>
-        <w:rPr>
-          <w:rFonts w:ascii="Montserrat" w:hAnsi="Montserrat"/>
-          <w:b/>
-          <w:bCs/>
-          <w:sz w:val="24"/>
-          <w:szCs w:val="24"/>
-        </w:rPr>
-        <w:t>}</w:t>
-      </w:r>
-      <w:r>
-        <w:rPr>
-          <w:rFonts w:ascii="Montserrat" w:hAnsi="Montserrat"/>
-          <w:sz w:val="24"/>
-          <w:szCs w:val="24"/>
-        </w:rPr>
-        <w:t>. O presente visa cumprir ao disposto no Decreto 8.373/2014 do Governo Federal, o qual instituiu a obrigatoriedade de procedimentos de envio das diversas declarações, formulários, termos e documentos relativos à relação de trabalho, (ESOCIAL) Sistema de Escrituração Digital das Obrigações Fiscais Previdenciárias e trabalhistas.</w:t>
+        <w:t>{introdu</w:t>
+      </w:r>
+      <w:r>
+        <w:rPr>
+          <w:rFonts w:ascii="Montserrat" w:hAnsi="Montserrat"/>
+          <w:sz w:val="24"/>
+          <w:szCs w:val="24"/>
+        </w:rPr>
+        <w:t>ca</w:t>
+      </w:r>
+      <w:r>
+        <w:rPr>
+          <w:rFonts w:ascii="Montserrat" w:hAnsi="Montserrat"/>
+          <w:sz w:val="24"/>
+          <w:szCs w:val="24"/>
+        </w:rPr>
+        <w:t>o}</w:t>
       </w:r>
     </w:p>
     <w:bookmarkEnd w:id="1"/>
@@ -1587,29 +1495,7 @@
           <w:sz w:val="24"/>
           <w:szCs w:val="24"/>
         </w:rPr>
-        <w:t>{</w:t>
-      </w:r>
-      <w:proofErr w:type="spellStart"/>
-      <w:r>
-        <w:rPr>
-          <w:rFonts w:ascii="Montserrat" w:hAnsi="Montserrat"/>
-          <w:b/>
-          <w:bCs/>
-          <w:sz w:val="24"/>
-          <w:szCs w:val="24"/>
-        </w:rPr>
-        <w:t>data_inicial</w:t>
-      </w:r>
-      <w:proofErr w:type="spellEnd"/>
-      <w:r>
-        <w:rPr>
-          <w:rFonts w:ascii="Montserrat" w:hAnsi="Montserrat"/>
-          <w:b/>
-          <w:bCs/>
-          <w:sz w:val="24"/>
-          <w:szCs w:val="24"/>
-        </w:rPr>
-        <w:t xml:space="preserve">} </w:t>
+        <w:t xml:space="preserve">{data_inicial} </w:t>
       </w:r>
       <w:bookmarkEnd w:id="4"/>
       <w:r>
@@ -1628,18 +1514,7 @@
           <w:sz w:val="24"/>
           <w:szCs w:val="24"/>
         </w:rPr>
-        <w:t>{</w:t>
-      </w:r>
-      <w:proofErr w:type="spellStart"/>
-      <w:r>
-        <w:rPr>
-          <w:rFonts w:ascii="Montserrat" w:hAnsi="Montserrat"/>
-          <w:b/>
-          <w:bCs/>
-          <w:sz w:val="24"/>
-          <w:szCs w:val="24"/>
-        </w:rPr>
-        <w:t>data_</w:t>
+        <w:t>{data_</w:t>
       </w:r>
       <w:r>
         <w:rPr>
@@ -1651,7 +1526,6 @@
         </w:rPr>
         <w:t>final</w:t>
       </w:r>
-      <w:proofErr w:type="spellEnd"/>
       <w:r>
         <w:rPr>
           <w:rFonts w:ascii="Montserrat" w:hAnsi="Montserrat"/>
@@ -1810,9 +1684,8 @@
           <w:sz w:val="24"/>
           <w:szCs w:val="24"/>
         </w:rPr>
-        <w:t>{</w:t>
-      </w:r>
-      <w:proofErr w:type="spellStart"/>
+        <w:t>{data_</w:t>
+      </w:r>
       <w:r>
         <w:rPr>
           <w:rFonts w:ascii="Montserrat" w:hAnsi="Montserrat"/>
@@ -1822,7 +1695,7 @@
           <w:sz w:val="24"/>
           <w:szCs w:val="24"/>
         </w:rPr>
-        <w:t>data_</w:t>
+        <w:t>servico</w:t>
       </w:r>
       <w:r>
         <w:rPr>
@@ -1833,18 +1706,6 @@
           <w:sz w:val="24"/>
           <w:szCs w:val="24"/>
         </w:rPr>
-        <w:t>servico</w:t>
-      </w:r>
-      <w:proofErr w:type="spellEnd"/>
-      <w:r>
-        <w:rPr>
-          <w:rFonts w:ascii="Montserrat" w:hAnsi="Montserrat"/>
-          <w:b/>
-          <w:bCs/>
-          <w:color w:val="auto"/>
-          <w:sz w:val="24"/>
-          <w:szCs w:val="24"/>
-        </w:rPr>
         <w:t>}</w:t>
       </w:r>
     </w:p>
@@ -1863,53 +1724,17 @@
           <w:sz w:val="24"/>
           <w:szCs w:val="24"/>
         </w:rPr>
-        <w:t>{</w:t>
-      </w:r>
-      <w:proofErr w:type="spellStart"/>
-      <w:r>
-        <w:rPr>
-          <w:rFonts w:ascii="Montserrat" w:hAnsi="Montserrat"/>
-          <w:sz w:val="24"/>
-          <w:szCs w:val="24"/>
-        </w:rPr>
-        <w:t>descricao_servico</w:t>
-      </w:r>
-      <w:proofErr w:type="spellEnd"/>
-      <w:r>
-        <w:rPr>
-          <w:rFonts w:ascii="Montserrat" w:hAnsi="Montserrat"/>
-          <w:sz w:val="24"/>
-          <w:szCs w:val="24"/>
-        </w:rPr>
-        <w:t>};</w:t>
-      </w:r>
-    </w:p>
-    <w:p>
-      <w:r>
-        <w:rPr>
-          <w:rFonts w:ascii="Montserrat" w:hAnsi="Montserrat"/>
-          <w:sz w:val="24"/>
-          <w:szCs w:val="24"/>
-        </w:rPr>
-        <w:t>{/</w:t>
-      </w:r>
-      <w:proofErr w:type="spellStart"/>
-      <w:r>
-        <w:rPr>
-          <w:rFonts w:ascii="Montserrat" w:hAnsi="Montserrat"/>
-          <w:sz w:val="24"/>
-          <w:szCs w:val="24"/>
-        </w:rPr>
-        <w:t>lista_servicos</w:t>
-      </w:r>
-      <w:proofErr w:type="spellEnd"/>
-      <w:r>
-        <w:rPr>
-          <w:rFonts w:ascii="Montserrat" w:hAnsi="Montserrat"/>
-          <w:sz w:val="24"/>
-          <w:szCs w:val="24"/>
-        </w:rPr>
-        <w:t>}</w:t>
+        <w:t>{descricao_servico};</w:t>
+      </w:r>
+    </w:p>
+    <w:p>
+      <w:r>
+        <w:rPr>
+          <w:rFonts w:ascii="Montserrat" w:hAnsi="Montserrat"/>
+          <w:sz w:val="24"/>
+          <w:szCs w:val="24"/>
+        </w:rPr>
+        <w:t>{/lista_servicos}</w:t>
       </w:r>
     </w:p>
     <w:p>
@@ -2194,25 +2019,7 @@
           <w:sz w:val="24"/>
           <w:szCs w:val="24"/>
         </w:rPr>
-        <w:t>Salvador - BA, {</w:t>
-      </w:r>
-      <w:proofErr w:type="spellStart"/>
-      <w:r>
-        <w:rPr>
-          <w:rFonts w:ascii="Montserrat" w:hAnsi="Montserrat"/>
-          <w:sz w:val="24"/>
-          <w:szCs w:val="24"/>
-        </w:rPr>
-        <w:t>data_extenso_emissao</w:t>
-      </w:r>
-      <w:proofErr w:type="spellEnd"/>
-      <w:r>
-        <w:rPr>
-          <w:rFonts w:ascii="Montserrat" w:hAnsi="Montserrat"/>
-          <w:sz w:val="24"/>
-          <w:szCs w:val="24"/>
-        </w:rPr>
-        <w:t>}.</w:t>
+        <w:t>Salvador - BA, {data_extenso_emissao}.</w:t>
       </w:r>
     </w:p>
     <w:p>
@@ -2613,25 +2420,7 @@
           <w:sz w:val="24"/>
           <w:szCs w:val="24"/>
         </w:rPr>
-        <w:t xml:space="preserve">Evidências de suporte S-2501 (prints, trilha de ajustes e reconciliação com </w:t>
-      </w:r>
-      <w:proofErr w:type="spellStart"/>
-      <w:r>
-        <w:rPr>
-          <w:rFonts w:ascii="Montserrat" w:hAnsi="Montserrat"/>
-          <w:sz w:val="24"/>
-          <w:szCs w:val="24"/>
-        </w:rPr>
-        <w:t>DCTFWeb</w:t>
-      </w:r>
-      <w:proofErr w:type="spellEnd"/>
-      <w:r>
-        <w:rPr>
-          <w:rFonts w:ascii="Montserrat" w:hAnsi="Montserrat"/>
-          <w:sz w:val="24"/>
-          <w:szCs w:val="24"/>
-        </w:rPr>
-        <w:t>).</w:t>
+        <w:t>Evidências de suporte S-2501 (prints, trilha de ajustes e reconciliação com DCTFWeb).</w:t>
       </w:r>
       <w:bookmarkEnd w:id="16"/>
     </w:p>

</xml_diff>